<commit_message>
Mise à jour du contenu de l'Atelier 1 et ajout d'un fichier PDF associé
</commit_message>
<xml_diff>
--- a/documents/Atelier 1.docx
+++ b/documents/Atelier 1.docx
@@ -32,10 +32,7 @@
         <w:pStyle w:val="Titre3"/>
       </w:pPr>
       <w:r>
-        <w:t xml:space="preserve">Page 3 : </w:t>
-      </w:r>
-      <w:r>
-        <w:t>Mission 1 : Nettoyer le code existant et ajouter une fonctionnalité</w:t>
+        <w:t>Page 3 : Mission 1 : Nettoyer le code existant et ajouter une fonctionnalité</w:t>
       </w:r>
     </w:p>
     <w:p>
@@ -65,10 +62,7 @@
         <w:pStyle w:val="Titre3"/>
       </w:pPr>
       <w:r>
-        <w:t xml:space="preserve">Page 25 : </w:t>
-      </w:r>
-      <w:r>
-        <w:t>Déployer le site et gérer le déploiement continu</w:t>
+        <w:t>Page 25 : Déployer le site et gérer le déploiement continu</w:t>
       </w:r>
     </w:p>
     <w:p>
@@ -151,15 +145,7 @@
         <w:t>pôle Développement</w:t>
       </w:r>
       <w:r>
-        <w:t xml:space="preserve"> consiste à proposer des solutions d'hébergements sur des serveurs dédiés. Les développeurs possèdent également une expertise dans l’intégration de services, le développement logiciel et </w:t>
-      </w:r>
-      <w:proofErr w:type="gramStart"/>
-      <w:r>
-        <w:t>la</w:t>
-      </w:r>
-      <w:proofErr w:type="gramEnd"/>
-      <w:r>
-        <w:t xml:space="preserve"> gestion/création de bases de données.</w:t>
+        <w:t> consiste à proposer des solutions d'hébergements sur des serveurs dédiés. Les développeurs possèdent également une expertise dans l’intégration de services, le développement logiciel et la gestion/création de bases de données.</w:t>
       </w:r>
       <w:r>
         <w:br/>
@@ -198,7 +184,41 @@
         <w:t> pour ses clients.</w:t>
       </w:r>
     </w:p>
-    <w:p/>
+    <w:p>
+      <w:r>
+        <w:t xml:space="preserve">L’atelier à été faite en utilisant le logiciel Apache </w:t>
+      </w:r>
+      <w:proofErr w:type="spellStart"/>
+      <w:r>
+        <w:t>Netbeans</w:t>
+      </w:r>
+      <w:proofErr w:type="spellEnd"/>
+      <w:r>
+        <w:t xml:space="preserve"> en </w:t>
+      </w:r>
+      <w:proofErr w:type="spellStart"/>
+      <w:r>
+        <w:t>php</w:t>
+      </w:r>
+      <w:proofErr w:type="spellEnd"/>
+      <w:r>
+        <w:t xml:space="preserve"> et utilise une BDD</w:t>
+      </w:r>
+      <w:r>
+        <w:t xml:space="preserve"> de plus vous pourrez trouver le </w:t>
+      </w:r>
+      <w:proofErr w:type="spellStart"/>
+      <w:r>
+        <w:t>github</w:t>
+      </w:r>
+      <w:proofErr w:type="spellEnd"/>
+      <w:r>
+        <w:t xml:space="preserve"> du dépôt à cette adresse : </w:t>
+      </w:r>
+      <w:r>
+        <w:t>https://github.com/0mega15/MediatekFormation</w:t>
+      </w:r>
+    </w:p>
     <w:p>
       <w:pPr>
         <w:pStyle w:val="Titre2"/>
@@ -331,7 +351,6 @@
         <w:rPr>
           <w:noProof/>
         </w:rPr>
-        <w:lastRenderedPageBreak/>
         <w:drawing>
           <wp:inline distT="0" distB="0" distL="0" distR="0" wp14:anchorId="6F511959" wp14:editId="142180FF">
             <wp:extent cx="4566791" cy="180000"/>
@@ -4257,7 +4276,6 @@
           <w:lang w:val="en-GB"/>
         </w:rPr>
       </w:pPr>
-      <w:proofErr w:type="gramStart"/>
       <w:r>
         <w:rPr>
           <w:rFonts w:ascii="Consolas" w:hAnsi="Consolas" w:cs="Courier New"/>
@@ -4266,18 +4284,7 @@
           <w:szCs w:val="17"/>
           <w:lang w:val="en-GB"/>
         </w:rPr>
-        <w:t>on:</w:t>
-      </w:r>
-      <w:proofErr w:type="gramEnd"/>
-      <w:r>
-        <w:rPr>
-          <w:rFonts w:ascii="Consolas" w:hAnsi="Consolas" w:cs="Courier New"/>
-          <w:color w:val="000000"/>
-          <w:sz w:val="17"/>
-          <w:szCs w:val="17"/>
-          <w:lang w:val="en-GB"/>
-        </w:rPr>
-        <w:t xml:space="preserve"> push </w:t>
+        <w:t xml:space="preserve">on: push </w:t>
       </w:r>
     </w:p>
     <w:p>
@@ -4779,29 +4786,7 @@
           <w:szCs w:val="17"/>
           <w:lang w:val="en-GB"/>
         </w:rPr>
-        <w:t xml:space="preserve"> - name: Sync files </w:t>
-      </w:r>
-      <w:proofErr w:type="gramStart"/>
-      <w:r>
-        <w:rPr>
-          <w:rFonts w:ascii="Consolas" w:hAnsi="Consolas" w:cs="Courier New"/>
-          <w:color w:val="000000"/>
-          <w:sz w:val="17"/>
-          <w:szCs w:val="17"/>
-          <w:lang w:val="en-GB"/>
-        </w:rPr>
-        <w:t>uses</w:t>
-      </w:r>
-      <w:proofErr w:type="gramEnd"/>
-      <w:r>
-        <w:rPr>
-          <w:rFonts w:ascii="Consolas" w:hAnsi="Consolas" w:cs="Courier New"/>
-          <w:color w:val="000000"/>
-          <w:sz w:val="17"/>
-          <w:szCs w:val="17"/>
-          <w:lang w:val="en-GB"/>
-        </w:rPr>
-        <w:t xml:space="preserve">: </w:t>
+        <w:t xml:space="preserve"> - name: Sync files uses: </w:t>
       </w:r>
       <w:hyperlink r:id="rId72" w:history="1">
         <w:r>
@@ -5955,6 +5940,7 @@
   <w:style w:type="character" w:default="1" w:styleId="Policepardfaut">
     <w:name w:val="Default Paragraph Font"/>
     <w:uiPriority w:val="1"/>
+    <w:semiHidden/>
     <w:unhideWhenUsed/>
   </w:style>
   <w:style w:type="table" w:default="1" w:styleId="TableauNormal">

</xml_diff>

<commit_message>
Ajout d'une page diplome et des diplomes correspondant
</commit_message>
<xml_diff>
--- a/documents/Atelier 1.docx
+++ b/documents/Atelier 1.docx
@@ -145,7 +145,18 @@
         <w:t>pôle Développement</w:t>
       </w:r>
       <w:r>
-        <w:t> consiste à proposer des solutions d'hébergements sur des serveurs dédiés. Les développeurs possèdent également une expertise dans l’intégration de services, le développement logiciel et la gestion/création de bases de données.</w:t>
+        <w:t xml:space="preserve"> consiste à proposer des solutions d'hébergements sur des serveurs dédiés. Les développeurs possèdent également une expertise dans l’intégration de services, le développement logiciel et </w:t>
+      </w:r>
+      <w:proofErr w:type="gramStart"/>
+      <w:r>
+        <w:t>l</w:t>
+      </w:r>
+      <w:r>
+        <w:t>a</w:t>
+      </w:r>
+      <w:proofErr w:type="gramEnd"/>
+      <w:r>
+        <w:t xml:space="preserve"> gestion/création de bases de données.</w:t>
       </w:r>
       <w:r>
         <w:br/>
@@ -4276,6 +4287,7 @@
           <w:lang w:val="en-GB"/>
         </w:rPr>
       </w:pPr>
+      <w:proofErr w:type="gramStart"/>
       <w:r>
         <w:rPr>
           <w:rFonts w:ascii="Consolas" w:hAnsi="Consolas" w:cs="Courier New"/>
@@ -4284,7 +4296,18 @@
           <w:szCs w:val="17"/>
           <w:lang w:val="en-GB"/>
         </w:rPr>
-        <w:t xml:space="preserve">on: push </w:t>
+        <w:t>on:</w:t>
+      </w:r>
+      <w:proofErr w:type="gramEnd"/>
+      <w:r>
+        <w:rPr>
+          <w:rFonts w:ascii="Consolas" w:hAnsi="Consolas" w:cs="Courier New"/>
+          <w:color w:val="000000"/>
+          <w:sz w:val="17"/>
+          <w:szCs w:val="17"/>
+          <w:lang w:val="en-GB"/>
+        </w:rPr>
+        <w:t xml:space="preserve"> push </w:t>
       </w:r>
     </w:p>
     <w:p>
@@ -4786,7 +4809,29 @@
           <w:szCs w:val="17"/>
           <w:lang w:val="en-GB"/>
         </w:rPr>
-        <w:t xml:space="preserve"> - name: Sync files uses: </w:t>
+        <w:t xml:space="preserve"> - name: Sync files </w:t>
+      </w:r>
+      <w:proofErr w:type="gramStart"/>
+      <w:r>
+        <w:rPr>
+          <w:rFonts w:ascii="Consolas" w:hAnsi="Consolas" w:cs="Courier New"/>
+          <w:color w:val="000000"/>
+          <w:sz w:val="17"/>
+          <w:szCs w:val="17"/>
+          <w:lang w:val="en-GB"/>
+        </w:rPr>
+        <w:t>uses</w:t>
+      </w:r>
+      <w:proofErr w:type="gramEnd"/>
+      <w:r>
+        <w:rPr>
+          <w:rFonts w:ascii="Consolas" w:hAnsi="Consolas" w:cs="Courier New"/>
+          <w:color w:val="000000"/>
+          <w:sz w:val="17"/>
+          <w:szCs w:val="17"/>
+          <w:lang w:val="en-GB"/>
+        </w:rPr>
+        <w:t xml:space="preserve">: </w:t>
       </w:r>
       <w:hyperlink r:id="rId72" w:history="1">
         <w:r>

</xml_diff>